<commit_message>
Alta de socios desde web: rol Coordinador, gestión de PIN y cambio forzado al 1er login
coop_members v18.0.1.4.0:
- Rol 'coordinator' en coop.member.role -> group_coop_coordinador (helper _coop_group)
- write() sincroniza el grupo del res.users al cambiar el Rol
- Campos app_user_id/has_app_access/app_login + panel 'Acceso a la app' en la ficha
- Botones Reiniciar PIN y Cambiar PIN (wizard coop.member.pin.wizard)
- res.users.coop_pin_debe_cambiar + set_coop_pin(pin, force_change) para el 1er login
- Tests: rol coordinador, sync rol upgrade/downgrade, reset, wizard, flag

coop_portal v18.0.1.7.0:
- /app/cambiar-pin (+POST) que exige PIN distinto al actual
- Enforcement en un punto: override ir.http._dispatch redirige /app/* mientras el
  flag este activo (allowlist: cambiar-pin, ingresar, manifest, sw)

docs: Manual-Administrador actualizado (botones PIN, rol=tipo de usuario, 1er login)

Revisado por subagentes (2 pasadas) -> 0 criticos, bypass cerrado.
</commit_message>
<xml_diff>
--- a/docs/Manual-Administrador-coopeapp.docx
+++ b/docs/Manual-Administrador-coopeapp.docx
@@ -1494,7 +1494,39 @@
           <w:b w:val="false"/>
           <w:bCs w:val="false"/>
         </w:rPr>
-        <w:t xml:space="preserve">.</w:t>
+        <w:t xml:space="preserve"> (y, una vez creado, </w:t>
+      </w:r>
+      <w:r>
+        <w:rPr>
+          <w:rFonts w:ascii="Arial" w:cs="Arial" w:eastAsia="Arial" w:hAnsi="Arial"/>
+          <w:b/>
+          <w:bCs/>
+        </w:rPr>
+        <w:t xml:space="preserve">Reiniciar PIN</w:t>
+      </w:r>
+      <w:r>
+        <w:rPr>
+          <w:rFonts w:ascii="Arial" w:cs="Arial" w:eastAsia="Arial" w:hAnsi="Arial"/>
+          <w:b w:val="false"/>
+          <w:bCs w:val="false"/>
+        </w:rPr>
+        <w:t xml:space="preserve"> y </w:t>
+      </w:r>
+      <w:r>
+        <w:rPr>
+          <w:rFonts w:ascii="Arial" w:cs="Arial" w:eastAsia="Arial" w:hAnsi="Arial"/>
+          <w:b/>
+          <w:bCs/>
+        </w:rPr>
+        <w:t xml:space="preserve">Cambiar PIN</w:t>
+      </w:r>
+      <w:r>
+        <w:rPr>
+          <w:rFonts w:ascii="Arial" w:cs="Arial" w:eastAsia="Arial" w:hAnsi="Arial"/>
+          <w:b w:val="false"/>
+          <w:bCs w:val="false"/>
+        </w:rPr>
+        <w:t xml:space="preserve">). El campo Rol define el tipo de usuario en la app.</w:t>
       </w:r>
     </w:p>
     <w:p>
@@ -1555,7 +1587,7 @@
           <w:b w:val="false"/>
           <w:bCs w:val="false"/>
         </w:rPr>
-        <w:t xml:space="preserve">cuando das de alta un socio, el sistema le crea solo el acceso a la app (usuario = DNI, PIN = ultimos 4 del DNI). No tenes que crear usuarios a mano.</w:t>
+        <w:t xml:space="preserve">cuando das de alta un socio, el sistema le crea solo el acceso a la app (usuario = DNI, PIN = ultimos 4 del DNI). No tenes que crear usuarios a mano ni entrar a Ajustes / Usuarios. El PIN y el tipo de usuario se gestionan desde la ficha del socio: el campo Rol (Operario, Coordinador de Obra, Consejo, Sindico, Administrador) fija los permisos, y los botones Reiniciar PIN / Cambiar PIN administran la clave sin tocar nada mas.</w:t>
       </w:r>
     </w:p>
     <w:p>
@@ -3027,7 +3059,7 @@
           <w:b w:val="false"/>
           <w:bCs w:val="false"/>
         </w:rPr>
-        <w:t xml:space="preserve"> los ultimos 4 digitos del DNI. Recomenda cambiarlo en el primer uso.</w:t>
+        <w:t xml:space="preserve"> los ultimos 4 digitos del DNI. En el primer ingreso a la app, el sistema le exige al socio elegir un PIN nuevo (distinto al del DNI): asi nadie queda con el PIN inicial. Lo mismo pasa despues de un Reiniciar PIN.</w:t>
       </w:r>
     </w:p>
     <w:p>
@@ -3061,7 +3093,7 @@
           <w:b w:val="false"/>
           <w:bCs w:val="false"/>
         </w:rPr>
-        <w:t xml:space="preserve"> si un socio se queda afuera, podes reiniciarle el PIN desde su usuario.</w:t>
+        <w:t xml:space="preserve"> si un socio se queda afuera, abri su ficha (Cooperativa / Socios) y toca Reiniciar PIN: vuelve a los ultimos 4 del DNI. Para poner una clave a mano (4 a 8 digitos) usa Cambiar PIN. No hace falta entrar a Ajustes / Usuarios.</w:t>
       </w:r>
     </w:p>
     <w:p>
@@ -4195,7 +4227,7 @@
                 <w:sz w:val="19"/>
                 <w:szCs w:val="19"/>
               </w:rPr>
-              <w:t xml:space="preserve">Reiniciaselo desde su usuario. Por defecto es los ultimos 4 del DNI.</w:t>
+              <w:t xml:space="preserve">Abri su ficha en Cooperativa / Socios y toca Reiniciar PIN (vuelve a los ultimos 4 del DNI) o Cambiar PIN para poner uno a mano.</w:t>
             </w:r>
           </w:p>
         </w:tc>

</xml_diff>